<commit_message>
Itens 1 ao 3, feitos
</commit_message>
<xml_diff>
--- a/Documentação/Doc Produto Software - Projeto Integrador Interdisciplinar FRONT END_2024_Ajustada .docx
+++ b/Documentação/Doc Produto Software - Projeto Integrador Interdisciplinar FRONT END_2024_Ajustada .docx
@@ -1091,9 +1091,36 @@
       </w:pPr>
       <w:r>
         <w:rPr>
+          <w:rFonts w:ascii="Arial" w:eastAsia="Calibri" w:hAnsi="Arial" w:cs="Arial"/>
+        </w:rPr>
+        <w:t>Problemas:</w:t>
+      </w:r>
+      <w:r>
+        <w:rPr>
           <w:rFonts w:ascii="Calibri" w:eastAsia="Calibri" w:hAnsi="Calibri" w:cs="Calibri"/>
         </w:rPr>
-        <w:t xml:space="preserve">Problemas: Liste os principais problemas ou lacunas da interface existente, ou, no caso de uma nova solução, descreva os problemas que a interface deverá resolver. Considere-se no lugar do usuário final: quais serviços ou funcionalidades seriam mais valiosos? Quais problemas ou necessidades você gostaria de ver resolvidos? </w:t>
+        <w:t xml:space="preserve"> </w:t>
+      </w:r>
+      <w:r>
+        <w:rPr>
+          <w:rFonts w:ascii="Arial" w:eastAsia="Calibri" w:hAnsi="Arial" w:cs="Arial"/>
+          <w:lang w:eastAsia="pt-BR"/>
+        </w:rPr>
+        <w:t xml:space="preserve">O atual site do Passatempo possui diversos problemas, entre eles o que mais se destaca é a má disposição do layout, o qual possui muita informação desorganizada, tonalidades de cor que não combinam e interface não intuitiva e difícil de se utilizar. Além da falta </w:t>
+      </w:r>
+      <w:r>
+        <w:rPr>
+          <w:rFonts w:ascii="Arial" w:eastAsia="Calibri" w:hAnsi="Arial" w:cs="Arial"/>
+          <w:lang w:eastAsia="pt-BR"/>
+        </w:rPr>
+        <w:t>de requisitos, como um formulário para entrar em contato ou fazer uma doação.</w:t>
+      </w:r>
+      <w:r>
+        <w:rPr>
+          <w:rFonts w:ascii="Arial" w:eastAsia="Calibri" w:hAnsi="Arial" w:cs="Arial"/>
+          <w:lang w:eastAsia="pt-BR"/>
+        </w:rPr>
+        <w:t xml:space="preserve"> </w:t>
       </w:r>
     </w:p>
     <w:p>
@@ -1110,9 +1137,45 @@
       </w:pPr>
       <w:r>
         <w:rPr>
+          <w:rFonts w:ascii="Arial" w:eastAsia="Calibri" w:hAnsi="Arial" w:cs="Arial"/>
+        </w:rPr>
+        <w:t>Objetivos</w:t>
+      </w:r>
+      <w:r>
+        <w:rPr>
           <w:rFonts w:ascii="Calibri" w:eastAsia="Calibri" w:hAnsi="Calibri" w:cs="Calibri"/>
         </w:rPr>
-        <w:t xml:space="preserve">Objetivos: Com base na análise e identificação de problemas, defina objetivos claros para o redesenho ou criação da nova interface. Os objetivos devem ser mensuráveis e alinhados com as necessidades do usuário e as metas do projeto. Você pode voltar a esta fase para refinamentos após realizar entrevistas com os usuários. </w:t>
+        <w:t xml:space="preserve">: </w:t>
+      </w:r>
+      <w:r>
+        <w:rPr>
+          <w:rFonts w:ascii="Arial" w:eastAsia="Calibri" w:hAnsi="Arial" w:cs="Arial"/>
+          <w:lang w:eastAsia="pt-BR"/>
+        </w:rPr>
+        <w:t xml:space="preserve">Tendo em vista os problemas do atual site, podemos concluir que o foco de melhora no site deve ser no layout, principalmente na organização da </w:t>
+      </w:r>
+      <w:proofErr w:type="spellStart"/>
+      <w:r>
+        <w:rPr>
+          <w:rFonts w:ascii="Arial" w:eastAsia="Calibri" w:hAnsi="Arial" w:cs="Arial"/>
+          <w:lang w:eastAsia="pt-BR"/>
+        </w:rPr>
+        <w:t>pagina</w:t>
+      </w:r>
+      <w:proofErr w:type="spellEnd"/>
+      <w:r>
+        <w:rPr>
+          <w:rFonts w:ascii="Arial" w:eastAsia="Calibri" w:hAnsi="Arial" w:cs="Arial"/>
+          <w:lang w:eastAsia="pt-BR"/>
+        </w:rPr>
+        <w:t>, selecionando apenas as informações necessárias e as organizando da melhor forma possível</w:t>
+      </w:r>
+      <w:r>
+        <w:rPr>
+          <w:rFonts w:ascii="Arial" w:eastAsia="Calibri" w:hAnsi="Arial" w:cs="Arial"/>
+          <w:lang w:eastAsia="pt-BR"/>
+        </w:rPr>
+        <w:t>, outro foco deve ser na tipografia e paleta de cores, tornando o site mais atraente aos olhares do público e de fácil compreensão, além de trazer funções necessárias para o site como um formulário de contato.</w:t>
       </w:r>
     </w:p>
     <w:p>
@@ -1154,9 +1217,219 @@
       </w:pPr>
       <w:r>
         <w:rPr>
+          <w:rFonts w:ascii="Arial" w:eastAsia="Calibri" w:hAnsi="Arial" w:cs="Arial"/>
+        </w:rPr>
+        <w:t>Modernizar o site, trazendo elementos responsivos e interativos</w:t>
+      </w:r>
+      <w:r>
+        <w:rPr>
+          <w:rFonts w:ascii="Arial" w:eastAsia="Calibri" w:hAnsi="Arial" w:cs="Arial"/>
+        </w:rPr>
+        <w:t xml:space="preserve">, tomando como base o site da Apple. </w:t>
+      </w:r>
+    </w:p>
+    <w:p>
+      <w:pPr>
+        <w:pStyle w:val="PargrafodaLista"/>
+        <w:numPr>
+          <w:ilvl w:val="0"/>
+          <w:numId w:val="3"/>
+        </w:numPr>
+        <w:spacing w:line="259" w:lineRule="auto"/>
+        <w:ind w:left="1068"/>
+        <w:rPr>
           <w:rFonts w:ascii="Calibri" w:eastAsia="Calibri" w:hAnsi="Calibri" w:cs="Calibri"/>
         </w:rPr>
-        <w:t>Listar ideias criativas para o redesenho ou para a nova interface. Agrupe ideias semelhantes. Avalie o potencial de cada ideia, considerando fatores como inovação, facilidade de implementação e impacto potencial no usuário.</w:t>
+      </w:pPr>
+      <w:r>
+        <w:rPr>
+          <w:rFonts w:ascii="Arial" w:eastAsia="Calibri" w:hAnsi="Arial" w:cs="Arial"/>
+        </w:rPr>
+        <w:t xml:space="preserve">Tomar como base o site do </w:t>
+      </w:r>
+      <w:proofErr w:type="spellStart"/>
+      <w:r>
+        <w:rPr>
+          <w:rFonts w:ascii="Arial" w:eastAsia="Calibri" w:hAnsi="Arial" w:cs="Arial"/>
+        </w:rPr>
+        <w:t>McDonalds</w:t>
+      </w:r>
+      <w:proofErr w:type="spellEnd"/>
+      <w:r>
+        <w:rPr>
+          <w:rFonts w:ascii="Arial" w:eastAsia="Calibri" w:hAnsi="Arial" w:cs="Arial"/>
+        </w:rPr>
+        <w:t xml:space="preserve">, para criar a </w:t>
+      </w:r>
+      <w:proofErr w:type="spellStart"/>
+      <w:r>
+        <w:rPr>
+          <w:rFonts w:ascii="Arial" w:eastAsia="Calibri" w:hAnsi="Arial" w:cs="Arial"/>
+        </w:rPr>
+        <w:t>indentidade</w:t>
+      </w:r>
+      <w:proofErr w:type="spellEnd"/>
+      <w:r>
+        <w:rPr>
+          <w:rFonts w:ascii="Arial" w:eastAsia="Calibri" w:hAnsi="Arial" w:cs="Arial"/>
+        </w:rPr>
+        <w:t xml:space="preserve"> visual. </w:t>
+      </w:r>
+    </w:p>
+    <w:p>
+      <w:pPr>
+        <w:pStyle w:val="PargrafodaLista"/>
+        <w:numPr>
+          <w:ilvl w:val="0"/>
+          <w:numId w:val="3"/>
+        </w:numPr>
+        <w:spacing w:line="259" w:lineRule="auto"/>
+        <w:ind w:left="1068"/>
+        <w:rPr>
+          <w:rFonts w:ascii="Calibri" w:eastAsia="Calibri" w:hAnsi="Calibri" w:cs="Calibri"/>
+        </w:rPr>
+      </w:pPr>
+      <w:r>
+        <w:rPr>
+          <w:rFonts w:ascii="Arial" w:eastAsia="Calibri" w:hAnsi="Arial" w:cs="Arial"/>
+        </w:rPr>
+        <w:t xml:space="preserve">Separar o site em três </w:t>
+      </w:r>
+      <w:proofErr w:type="spellStart"/>
+      <w:r>
+        <w:rPr>
+          <w:rFonts w:ascii="Arial" w:eastAsia="Calibri" w:hAnsi="Arial" w:cs="Arial"/>
+        </w:rPr>
+        <w:t>paginas</w:t>
+      </w:r>
+      <w:proofErr w:type="spellEnd"/>
+      <w:r>
+        <w:rPr>
+          <w:rFonts w:ascii="Arial" w:eastAsia="Calibri" w:hAnsi="Arial" w:cs="Arial"/>
+        </w:rPr>
+        <w:t>, uma contendo as informações necessárias, outra o conteúdo provido pela ONG e outra para contato.</w:t>
+      </w:r>
+    </w:p>
+    <w:p>
+      <w:pPr>
+        <w:pStyle w:val="PargrafodaLista"/>
+        <w:numPr>
+          <w:ilvl w:val="0"/>
+          <w:numId w:val="3"/>
+        </w:numPr>
+        <w:spacing w:line="259" w:lineRule="auto"/>
+        <w:ind w:left="1068"/>
+        <w:rPr>
+          <w:rFonts w:ascii="Calibri" w:eastAsia="Calibri" w:hAnsi="Calibri" w:cs="Calibri"/>
+        </w:rPr>
+      </w:pPr>
+      <w:r>
+        <w:rPr>
+          <w:rFonts w:ascii="Arial" w:eastAsia="Calibri" w:hAnsi="Arial" w:cs="Arial"/>
+        </w:rPr>
+        <w:t xml:space="preserve">Na </w:t>
+      </w:r>
+      <w:proofErr w:type="spellStart"/>
+      <w:r>
+        <w:rPr>
+          <w:rFonts w:ascii="Arial" w:eastAsia="Calibri" w:hAnsi="Arial" w:cs="Arial"/>
+        </w:rPr>
+        <w:t>pagina</w:t>
+      </w:r>
+      <w:proofErr w:type="spellEnd"/>
+      <w:r>
+        <w:rPr>
+          <w:rFonts w:ascii="Arial" w:eastAsia="Calibri" w:hAnsi="Arial" w:cs="Arial"/>
+        </w:rPr>
+        <w:t xml:space="preserve"> de catalogo, colocar um mapa </w:t>
+      </w:r>
+      <w:proofErr w:type="spellStart"/>
+      <w:r>
+        <w:rPr>
+          <w:rFonts w:ascii="Arial" w:eastAsia="Calibri" w:hAnsi="Arial" w:cs="Arial"/>
+        </w:rPr>
+        <w:t>mundi</w:t>
+      </w:r>
+      <w:proofErr w:type="spellEnd"/>
+      <w:r>
+        <w:rPr>
+          <w:rFonts w:ascii="Arial" w:eastAsia="Calibri" w:hAnsi="Arial" w:cs="Arial"/>
+        </w:rPr>
+        <w:t xml:space="preserve"> mostrando os países que o Passatempo possui os brinquedos</w:t>
+      </w:r>
+    </w:p>
+    <w:p>
+      <w:pPr>
+        <w:pStyle w:val="PargrafodaLista"/>
+        <w:numPr>
+          <w:ilvl w:val="0"/>
+          <w:numId w:val="3"/>
+        </w:numPr>
+        <w:spacing w:line="259" w:lineRule="auto"/>
+        <w:ind w:left="1068"/>
+        <w:rPr>
+          <w:rFonts w:ascii="Calibri" w:eastAsia="Calibri" w:hAnsi="Calibri" w:cs="Calibri"/>
+        </w:rPr>
+      </w:pPr>
+      <w:r>
+        <w:rPr>
+          <w:rFonts w:ascii="Arial" w:eastAsia="Calibri" w:hAnsi="Arial" w:cs="Arial"/>
+        </w:rPr>
+        <w:t xml:space="preserve">Na </w:t>
+      </w:r>
+      <w:proofErr w:type="spellStart"/>
+      <w:r>
+        <w:rPr>
+          <w:rFonts w:ascii="Arial" w:eastAsia="Calibri" w:hAnsi="Arial" w:cs="Arial"/>
+        </w:rPr>
+        <w:t>pagina</w:t>
+      </w:r>
+      <w:proofErr w:type="spellEnd"/>
+      <w:r>
+        <w:rPr>
+          <w:rFonts w:ascii="Arial" w:eastAsia="Calibri" w:hAnsi="Arial" w:cs="Arial"/>
+        </w:rPr>
+        <w:t xml:space="preserve"> catalogo, colocar uma seleção de países</w:t>
+      </w:r>
+    </w:p>
+    <w:p>
+      <w:pPr>
+        <w:pStyle w:val="PargrafodaLista"/>
+        <w:numPr>
+          <w:ilvl w:val="0"/>
+          <w:numId w:val="3"/>
+        </w:numPr>
+        <w:spacing w:line="259" w:lineRule="auto"/>
+        <w:ind w:left="1068"/>
+        <w:rPr>
+          <w:rFonts w:ascii="Calibri" w:eastAsia="Calibri" w:hAnsi="Calibri" w:cs="Calibri"/>
+        </w:rPr>
+      </w:pPr>
+      <w:r>
+        <w:rPr>
+          <w:rFonts w:ascii="Arial" w:eastAsia="Calibri" w:hAnsi="Arial" w:cs="Arial"/>
+        </w:rPr>
+        <w:t xml:space="preserve">Após selecionar o </w:t>
+      </w:r>
+      <w:proofErr w:type="gramStart"/>
+      <w:r>
+        <w:rPr>
+          <w:rFonts w:ascii="Arial" w:eastAsia="Calibri" w:hAnsi="Arial" w:cs="Arial"/>
+        </w:rPr>
+        <w:t>pais</w:t>
+      </w:r>
+      <w:proofErr w:type="gramEnd"/>
+      <w:r>
+        <w:rPr>
+          <w:rFonts w:ascii="Arial" w:eastAsia="Calibri" w:hAnsi="Arial" w:cs="Arial"/>
+        </w:rPr>
+        <w:t xml:space="preserve">, abrir outra tela mostrando os brinquedos daquele determinado pais. </w:t>
+      </w:r>
+      <w:r>
+        <w:rPr>
+          <w:rFonts w:ascii="Arial" w:eastAsia="Calibri" w:hAnsi="Arial" w:cs="Arial"/>
+        </w:rPr>
+        <w:t xml:space="preserve"> </w:t>
       </w:r>
     </w:p>
     <w:p>
@@ -1190,16 +1463,195 @@
           <w:ilvl w:val="0"/>
           <w:numId w:val="2"/>
         </w:numPr>
+        <w:spacing w:line="259" w:lineRule="auto"/>
         <w:rPr>
           <w:rFonts w:ascii="Calibri" w:eastAsia="Calibri" w:hAnsi="Calibri" w:cs="Calibri"/>
-          <w:lang w:eastAsia="pt-BR"/>
-        </w:rPr>
-      </w:pPr>
-      <w:r>
+        </w:rPr>
+      </w:pPr>
+      <w:r>
+        <w:rPr>
+          <w:rFonts w:ascii="Arial" w:eastAsia="Calibri" w:hAnsi="Arial" w:cs="Arial"/>
+        </w:rPr>
+        <w:t xml:space="preserve">Separar o site em três </w:t>
+      </w:r>
+      <w:proofErr w:type="spellStart"/>
+      <w:r>
+        <w:rPr>
+          <w:rFonts w:ascii="Arial" w:eastAsia="Calibri" w:hAnsi="Arial" w:cs="Arial"/>
+        </w:rPr>
+        <w:t>paginas</w:t>
+      </w:r>
+      <w:proofErr w:type="spellEnd"/>
+      <w:r>
+        <w:rPr>
+          <w:rFonts w:ascii="Arial" w:eastAsia="Calibri" w:hAnsi="Arial" w:cs="Arial"/>
+        </w:rPr>
+        <w:t>, uma contendo as informações necessárias, outra o conteúdo provido pela ONG e outra para contato.</w:t>
+      </w:r>
+    </w:p>
+    <w:p>
+      <w:pPr>
+        <w:pStyle w:val="PargrafodaLista"/>
+        <w:numPr>
+          <w:ilvl w:val="0"/>
+          <w:numId w:val="3"/>
+        </w:numPr>
+        <w:spacing w:line="259" w:lineRule="auto"/>
+        <w:ind w:left="1068"/>
         <w:rPr>
           <w:rFonts w:ascii="Calibri" w:eastAsia="Calibri" w:hAnsi="Calibri" w:cs="Calibri"/>
         </w:rPr>
-        <w:t xml:space="preserve">Enumere as ideias mais promissoras, ajustando detalhes e combinando-as, se necessário, para criar soluções mais robustas e eficazes. </w:t>
+      </w:pPr>
+      <w:r>
+        <w:rPr>
+          <w:rFonts w:ascii="Calibri" w:eastAsia="Calibri" w:hAnsi="Calibri" w:cs="Calibri"/>
+        </w:rPr>
+        <w:t xml:space="preserve"> </w:t>
+      </w:r>
+      <w:r>
+        <w:rPr>
+          <w:rFonts w:ascii="Arial" w:eastAsia="Calibri" w:hAnsi="Arial" w:cs="Arial"/>
+        </w:rPr>
+        <w:t xml:space="preserve">Na </w:t>
+      </w:r>
+      <w:proofErr w:type="spellStart"/>
+      <w:r>
+        <w:rPr>
+          <w:rFonts w:ascii="Arial" w:eastAsia="Calibri" w:hAnsi="Arial" w:cs="Arial"/>
+        </w:rPr>
+        <w:t>pagina</w:t>
+      </w:r>
+      <w:proofErr w:type="spellEnd"/>
+      <w:r>
+        <w:rPr>
+          <w:rFonts w:ascii="Arial" w:eastAsia="Calibri" w:hAnsi="Arial" w:cs="Arial"/>
+        </w:rPr>
+        <w:t xml:space="preserve"> de catalogo, colocar um mapa </w:t>
+      </w:r>
+      <w:proofErr w:type="spellStart"/>
+      <w:r>
+        <w:rPr>
+          <w:rFonts w:ascii="Arial" w:eastAsia="Calibri" w:hAnsi="Arial" w:cs="Arial"/>
+        </w:rPr>
+        <w:t>mundi</w:t>
+      </w:r>
+      <w:proofErr w:type="spellEnd"/>
+      <w:r>
+        <w:rPr>
+          <w:rFonts w:ascii="Arial" w:eastAsia="Calibri" w:hAnsi="Arial" w:cs="Arial"/>
+        </w:rPr>
+        <w:t xml:space="preserve"> mostrando os países que o Passatempo possui os brinquedos</w:t>
+      </w:r>
+      <w:r>
+        <w:rPr>
+          <w:rFonts w:ascii="Arial" w:eastAsia="Calibri" w:hAnsi="Arial" w:cs="Arial"/>
+        </w:rPr>
+        <w:t xml:space="preserve">, </w:t>
+      </w:r>
+      <w:r>
+        <w:rPr>
+          <w:rFonts w:ascii="Arial" w:eastAsia="Calibri" w:hAnsi="Arial" w:cs="Arial"/>
+        </w:rPr>
+        <w:t>colocar uma seleção de países</w:t>
+      </w:r>
+      <w:r>
+        <w:rPr>
+          <w:rFonts w:ascii="Arial" w:eastAsia="Calibri" w:hAnsi="Arial" w:cs="Arial"/>
+        </w:rPr>
+        <w:t xml:space="preserve"> e a</w:t>
+      </w:r>
+      <w:r>
+        <w:rPr>
+          <w:rFonts w:ascii="Arial" w:eastAsia="Calibri" w:hAnsi="Arial" w:cs="Arial"/>
+        </w:rPr>
+        <w:t xml:space="preserve">pós selecionar o </w:t>
+      </w:r>
+      <w:proofErr w:type="gramStart"/>
+      <w:r>
+        <w:rPr>
+          <w:rFonts w:ascii="Arial" w:eastAsia="Calibri" w:hAnsi="Arial" w:cs="Arial"/>
+        </w:rPr>
+        <w:t>pais</w:t>
+      </w:r>
+      <w:proofErr w:type="gramEnd"/>
+      <w:r>
+        <w:rPr>
+          <w:rFonts w:ascii="Arial" w:eastAsia="Calibri" w:hAnsi="Arial" w:cs="Arial"/>
+        </w:rPr>
+        <w:t>, abrir outra tela mostrando os brinquedos daquele determinado pais</w:t>
+      </w:r>
+      <w:r>
+        <w:rPr>
+          <w:rFonts w:ascii="Arial" w:eastAsia="Calibri" w:hAnsi="Arial" w:cs="Arial"/>
+        </w:rPr>
+        <w:t>.</w:t>
+      </w:r>
+    </w:p>
+    <w:p>
+      <w:pPr>
+        <w:pStyle w:val="PargrafodaLista"/>
+        <w:numPr>
+          <w:ilvl w:val="0"/>
+          <w:numId w:val="2"/>
+        </w:numPr>
+        <w:rPr>
+          <w:rFonts w:ascii="Calibri" w:eastAsia="Calibri" w:hAnsi="Calibri" w:cs="Calibri"/>
+          <w:lang w:eastAsia="pt-BR"/>
+        </w:rPr>
+      </w:pPr>
+      <w:r>
+        <w:rPr>
+          <w:rFonts w:ascii="Arial" w:eastAsia="Calibri" w:hAnsi="Arial" w:cs="Arial"/>
+        </w:rPr>
+        <w:t xml:space="preserve">Tomar como base o site do </w:t>
+      </w:r>
+      <w:proofErr w:type="spellStart"/>
+      <w:r>
+        <w:rPr>
+          <w:rFonts w:ascii="Arial" w:eastAsia="Calibri" w:hAnsi="Arial" w:cs="Arial"/>
+        </w:rPr>
+        <w:t>McDonalds</w:t>
+      </w:r>
+      <w:proofErr w:type="spellEnd"/>
+      <w:r>
+        <w:rPr>
+          <w:rFonts w:ascii="Arial" w:eastAsia="Calibri" w:hAnsi="Arial" w:cs="Arial"/>
+        </w:rPr>
+        <w:t xml:space="preserve">, para criar a </w:t>
+      </w:r>
+      <w:proofErr w:type="spellStart"/>
+      <w:r>
+        <w:rPr>
+          <w:rFonts w:ascii="Arial" w:eastAsia="Calibri" w:hAnsi="Arial" w:cs="Arial"/>
+        </w:rPr>
+        <w:t>indentidade</w:t>
+      </w:r>
+      <w:proofErr w:type="spellEnd"/>
+      <w:r>
+        <w:rPr>
+          <w:rFonts w:ascii="Arial" w:eastAsia="Calibri" w:hAnsi="Arial" w:cs="Arial"/>
+        </w:rPr>
+        <w:t xml:space="preserve"> visual.</w:t>
+      </w:r>
+    </w:p>
+    <w:p>
+      <w:pPr>
+        <w:pStyle w:val="PargrafodaLista"/>
+        <w:numPr>
+          <w:ilvl w:val="0"/>
+          <w:numId w:val="2"/>
+        </w:numPr>
+        <w:rPr>
+          <w:rFonts w:ascii="Calibri" w:eastAsia="Calibri" w:hAnsi="Calibri" w:cs="Calibri"/>
+          <w:lang w:eastAsia="pt-BR"/>
+        </w:rPr>
+      </w:pPr>
+      <w:r>
+        <w:rPr>
+          <w:rFonts w:ascii="Arial" w:eastAsia="Calibri" w:hAnsi="Arial" w:cs="Arial"/>
+        </w:rPr>
+        <w:lastRenderedPageBreak/>
+        <w:t>Modernizar o site, trazendo elementos responsivos e interativos, tomando como base o site da Apple.</w:t>
       </w:r>
     </w:p>
     <w:p>
@@ -1223,8 +1675,26 @@
           <w:b/>
           <w:bCs/>
         </w:rPr>
-        <w:t xml:space="preserve">Próximos Passos </w:t>
-      </w:r>
+        <w:t xml:space="preserve">Próximos </w:t>
+      </w:r>
+      <w:proofErr w:type="gramStart"/>
+      <w:r>
+        <w:rPr>
+          <w:rFonts w:ascii="Calibri" w:eastAsia="Calibri" w:hAnsi="Calibri" w:cs="Calibri"/>
+          <w:b/>
+          <w:bCs/>
+        </w:rPr>
+        <w:t xml:space="preserve">Passos </w:t>
+      </w:r>
+      <w:bookmarkStart w:id="1" w:name="_GoBack"/>
+      <w:bookmarkEnd w:id="1"/>
+      <w:r>
+        <w:rPr>
+          <w:rFonts w:ascii="Calibri" w:eastAsia="Calibri" w:hAnsi="Calibri" w:cs="Calibri"/>
+        </w:rPr>
+        <w:t>.</w:t>
+      </w:r>
+      <w:proofErr w:type="gramEnd"/>
     </w:p>
     <w:p>
       <w:pPr>
@@ -1240,9 +1710,65 @@
       </w:pPr>
       <w:r>
         <w:rPr>
-          <w:rFonts w:ascii="Calibri" w:eastAsia="Calibri" w:hAnsi="Calibri" w:cs="Calibri"/>
-        </w:rPr>
-        <w:t>Desenvolva um plano de ação detalhado, definindo as próximas etapas do projeto, como criação de protótipos, testes de usabilidade, e iterações de design. Para isso, apresente um cronograma inicial para a execução das próximas etapas, permitindo ajustes conforme necessário durante o andamento do projeto.</w:t>
+          <w:rFonts w:ascii="Arial" w:eastAsia="Calibri" w:hAnsi="Arial" w:cs="Arial"/>
+          <w:lang w:eastAsia="pt-BR"/>
+        </w:rPr>
+        <w:t xml:space="preserve">Em primeiro lugar, devemos criar um modelo da reformulação do site, com a nova paleta de cores, a disposição do conteúdo e a novo layout das </w:t>
+      </w:r>
+      <w:proofErr w:type="spellStart"/>
+      <w:r>
+        <w:rPr>
+          <w:rFonts w:ascii="Arial" w:eastAsia="Calibri" w:hAnsi="Arial" w:cs="Arial"/>
+          <w:lang w:eastAsia="pt-BR"/>
+        </w:rPr>
+        <w:t>paginas</w:t>
+      </w:r>
+      <w:proofErr w:type="spellEnd"/>
+      <w:r>
+        <w:rPr>
+          <w:rFonts w:ascii="Arial" w:eastAsia="Calibri" w:hAnsi="Arial" w:cs="Arial"/>
+          <w:lang w:eastAsia="pt-BR"/>
+        </w:rPr>
+        <w:t xml:space="preserve">, utilizando o </w:t>
+      </w:r>
+      <w:proofErr w:type="spellStart"/>
+      <w:r>
+        <w:rPr>
+          <w:rFonts w:ascii="Arial" w:eastAsia="Calibri" w:hAnsi="Arial" w:cs="Arial"/>
+          <w:lang w:eastAsia="pt-BR"/>
+        </w:rPr>
+        <w:t>figma</w:t>
+      </w:r>
+      <w:proofErr w:type="spellEnd"/>
+      <w:r>
+        <w:rPr>
+          <w:rFonts w:ascii="Arial" w:eastAsia="Calibri" w:hAnsi="Arial" w:cs="Arial"/>
+          <w:lang w:eastAsia="pt-BR"/>
+        </w:rPr>
+        <w:t xml:space="preserve">; depois criar os primeiros </w:t>
+      </w:r>
+      <w:r>
+        <w:rPr>
+          <w:rFonts w:ascii="Arial" w:eastAsia="Calibri" w:hAnsi="Arial" w:cs="Arial"/>
+          <w:lang w:eastAsia="pt-BR"/>
+        </w:rPr>
+        <w:t xml:space="preserve">protótipos das </w:t>
+      </w:r>
+      <w:proofErr w:type="spellStart"/>
+      <w:r>
+        <w:rPr>
+          <w:rFonts w:ascii="Arial" w:eastAsia="Calibri" w:hAnsi="Arial" w:cs="Arial"/>
+          <w:lang w:eastAsia="pt-BR"/>
+        </w:rPr>
+        <w:t>paginas</w:t>
+      </w:r>
+      <w:proofErr w:type="spellEnd"/>
+      <w:r>
+        <w:rPr>
+          <w:rFonts w:ascii="Arial" w:eastAsia="Calibri" w:hAnsi="Arial" w:cs="Arial"/>
+          <w:lang w:eastAsia="pt-BR"/>
+        </w:rPr>
+        <w:t xml:space="preserve">; mostrar os protótipos para o parceiros e recolher o feedback; com o feedback em mãos, fazer uma análise dos mesmos; alterar protótipo com base no feedback; desenvolver a versão final do projeto; apresentar para o parceiro. </w:t>
       </w:r>
     </w:p>
     <w:p>
@@ -1253,7 +1779,7 @@
           <w:lang w:eastAsia="pt-BR"/>
         </w:rPr>
       </w:pPr>
-      <w:bookmarkStart w:id="1" w:name="_Toc1712714278"/>
+      <w:bookmarkStart w:id="2" w:name="_Toc1712714278"/>
       <w:r>
         <w:rPr>
           <w:rFonts w:eastAsia="Times New Roman"/>
@@ -1261,7 +1787,7 @@
         </w:rPr>
         <w:t>Questionário / Entrevista / Outra Técnica de Extração de Informações do Usuário</w:t>
       </w:r>
-      <w:bookmarkEnd w:id="1"/>
+      <w:bookmarkEnd w:id="2"/>
     </w:p>
     <w:p>
       <w:pPr>
@@ -1373,16 +1899,7 @@
           <w:b/>
           <w:lang w:eastAsia="pt-BR"/>
         </w:rPr>
-        <w:t xml:space="preserve">“Quantas vezes por semana </w:t>
-      </w:r>
-      <w:r>
-        <w:rPr>
-          <w:rFonts w:ascii="Arial" w:eastAsia="Times New Roman" w:hAnsi="Arial" w:cs="Arial"/>
-          <w:b/>
-          <w:lang w:eastAsia="pt-BR"/>
-        </w:rPr>
-        <w:lastRenderedPageBreak/>
-        <w:t>você usa o celular/computador?”</w:t>
+        <w:t>“Quantas vezes por semana você usa o celular/computador?”</w:t>
       </w:r>
       <w:r>
         <w:rPr>
@@ -1534,7 +2051,7 @@
         </w:rPr>
         <w:t xml:space="preserve"> </w:t>
       </w:r>
-      <w:bookmarkStart w:id="2" w:name="_Toc726711315"/>
+      <w:bookmarkStart w:id="3" w:name="_Toc726711315"/>
       <w:r>
         <w:rPr>
           <w:rFonts w:eastAsia="Times New Roman"/>
@@ -1542,7 +2059,7 @@
         </w:rPr>
         <w:t>Análise do Questionário / Entrevista / Outra Técnica de Extração de Informações do Usuário</w:t>
       </w:r>
-      <w:bookmarkEnd w:id="2"/>
+      <w:bookmarkEnd w:id="3"/>
     </w:p>
     <w:p>
       <w:pPr>
@@ -1589,6 +2106,7 @@
           <w:rFonts w:ascii="Calibri" w:eastAsia="Times New Roman" w:hAnsi="Calibri" w:cs="Calibri"/>
           <w:lang w:eastAsia="pt-BR"/>
         </w:rPr>
+        <w:lastRenderedPageBreak/>
         <w:drawing>
           <wp:inline distT="0" distB="0" distL="0" distR="0" wp14:anchorId="6FE2F5F4" wp14:editId="7DC2EDA6">
             <wp:extent cx="5396230" cy="1370965"/>
@@ -1688,8 +2206,623 @@
           <w:lang w:eastAsia="pt-BR"/>
         </w:rPr>
       </w:pPr>
-      <w:bookmarkStart w:id="3" w:name="_GoBack"/>
-      <w:bookmarkEnd w:id="3"/>
+      <w:r>
+        <w:rPr>
+          <w:rFonts w:ascii="Calibri" w:eastAsia="Times New Roman" w:hAnsi="Calibri" w:cs="Calibri"/>
+          <w:lang w:eastAsia="pt-BR"/>
+        </w:rPr>
+        <w:drawing>
+          <wp:inline distT="0" distB="0" distL="0" distR="0" wp14:anchorId="0B8EFB98" wp14:editId="2150B04D">
+            <wp:extent cx="5396230" cy="3028950"/>
+            <wp:effectExtent l="0" t="0" r="0" b="0"/>
+            <wp:docPr id="3" name="Imagem 3"/>
+            <wp:cNvGraphicFramePr>
+              <a:graphicFrameLocks xmlns:a="http://schemas.openxmlformats.org/drawingml/2006/main" noChangeAspect="1"/>
+            </wp:cNvGraphicFramePr>
+            <a:graphic xmlns:a="http://schemas.openxmlformats.org/drawingml/2006/main">
+              <a:graphicData uri="http://schemas.openxmlformats.org/drawingml/2006/picture">
+                <pic:pic xmlns:pic="http://schemas.openxmlformats.org/drawingml/2006/picture">
+                  <pic:nvPicPr>
+                    <pic:cNvPr id="1" name=""/>
+                    <pic:cNvPicPr/>
+                  </pic:nvPicPr>
+                  <pic:blipFill>
+                    <a:blip r:embed="rId10"/>
+                    <a:stretch>
+                      <a:fillRect/>
+                    </a:stretch>
+                  </pic:blipFill>
+                  <pic:spPr>
+                    <a:xfrm>
+                      <a:off x="0" y="0"/>
+                      <a:ext cx="5396230" cy="3028950"/>
+                    </a:xfrm>
+                    <a:prstGeom prst="rect">
+                      <a:avLst/>
+                    </a:prstGeom>
+                  </pic:spPr>
+                </pic:pic>
+              </a:graphicData>
+            </a:graphic>
+          </wp:inline>
+        </w:drawing>
+      </w:r>
+    </w:p>
+    <w:p>
+      <w:pPr>
+        <w:spacing w:before="100" w:beforeAutospacing="1" w:after="100" w:afterAutospacing="1"/>
+        <w:ind w:left="720"/>
+        <w:jc w:val="both"/>
+        <w:rPr>
+          <w:rFonts w:ascii="Calibri" w:eastAsia="Times New Roman" w:hAnsi="Calibri" w:cs="Calibri"/>
+          <w:lang w:eastAsia="pt-BR"/>
+        </w:rPr>
+      </w:pPr>
+      <w:r>
+        <w:rPr>
+          <w:rFonts w:ascii="Calibri" w:eastAsia="Times New Roman" w:hAnsi="Calibri" w:cs="Calibri"/>
+          <w:lang w:eastAsia="pt-BR"/>
+        </w:rPr>
+        <w:lastRenderedPageBreak/>
+        <w:drawing>
+          <wp:inline distT="0" distB="0" distL="0" distR="0" wp14:anchorId="7E5327D7" wp14:editId="3EB4AF37">
+            <wp:extent cx="5396230" cy="2931795"/>
+            <wp:effectExtent l="0" t="0" r="0" b="1905"/>
+            <wp:docPr id="4" name="Imagem 4"/>
+            <wp:cNvGraphicFramePr>
+              <a:graphicFrameLocks xmlns:a="http://schemas.openxmlformats.org/drawingml/2006/main" noChangeAspect="1"/>
+            </wp:cNvGraphicFramePr>
+            <a:graphic xmlns:a="http://schemas.openxmlformats.org/drawingml/2006/main">
+              <a:graphicData uri="http://schemas.openxmlformats.org/drawingml/2006/picture">
+                <pic:pic xmlns:pic="http://schemas.openxmlformats.org/drawingml/2006/picture">
+                  <pic:nvPicPr>
+                    <pic:cNvPr id="1" name=""/>
+                    <pic:cNvPicPr/>
+                  </pic:nvPicPr>
+                  <pic:blipFill>
+                    <a:blip r:embed="rId11"/>
+                    <a:stretch>
+                      <a:fillRect/>
+                    </a:stretch>
+                  </pic:blipFill>
+                  <pic:spPr>
+                    <a:xfrm>
+                      <a:off x="0" y="0"/>
+                      <a:ext cx="5396230" cy="2931795"/>
+                    </a:xfrm>
+                    <a:prstGeom prst="rect">
+                      <a:avLst/>
+                    </a:prstGeom>
+                  </pic:spPr>
+                </pic:pic>
+              </a:graphicData>
+            </a:graphic>
+          </wp:inline>
+        </w:drawing>
+      </w:r>
+    </w:p>
+    <w:p>
+      <w:pPr>
+        <w:spacing w:before="100" w:beforeAutospacing="1" w:after="100" w:afterAutospacing="1"/>
+        <w:ind w:left="720"/>
+        <w:jc w:val="both"/>
+        <w:rPr>
+          <w:rFonts w:ascii="Calibri" w:eastAsia="Times New Roman" w:hAnsi="Calibri" w:cs="Calibri"/>
+          <w:lang w:eastAsia="pt-BR"/>
+        </w:rPr>
+      </w:pPr>
+      <w:r>
+        <w:rPr>
+          <w:rFonts w:ascii="Calibri" w:eastAsia="Times New Roman" w:hAnsi="Calibri" w:cs="Calibri"/>
+          <w:lang w:eastAsia="pt-BR"/>
+        </w:rPr>
+        <w:drawing>
+          <wp:inline distT="0" distB="0" distL="0" distR="0" wp14:anchorId="4C105846" wp14:editId="273F9395">
+            <wp:extent cx="5396230" cy="1706880"/>
+            <wp:effectExtent l="0" t="0" r="0" b="7620"/>
+            <wp:docPr id="5" name="Imagem 5"/>
+            <wp:cNvGraphicFramePr>
+              <a:graphicFrameLocks xmlns:a="http://schemas.openxmlformats.org/drawingml/2006/main" noChangeAspect="1"/>
+            </wp:cNvGraphicFramePr>
+            <a:graphic xmlns:a="http://schemas.openxmlformats.org/drawingml/2006/main">
+              <a:graphicData uri="http://schemas.openxmlformats.org/drawingml/2006/picture">
+                <pic:pic xmlns:pic="http://schemas.openxmlformats.org/drawingml/2006/picture">
+                  <pic:nvPicPr>
+                    <pic:cNvPr id="1" name=""/>
+                    <pic:cNvPicPr/>
+                  </pic:nvPicPr>
+                  <pic:blipFill>
+                    <a:blip r:embed="rId12"/>
+                    <a:stretch>
+                      <a:fillRect/>
+                    </a:stretch>
+                  </pic:blipFill>
+                  <pic:spPr>
+                    <a:xfrm>
+                      <a:off x="0" y="0"/>
+                      <a:ext cx="5396230" cy="1706880"/>
+                    </a:xfrm>
+                    <a:prstGeom prst="rect">
+                      <a:avLst/>
+                    </a:prstGeom>
+                  </pic:spPr>
+                </pic:pic>
+              </a:graphicData>
+            </a:graphic>
+          </wp:inline>
+        </w:drawing>
+      </w:r>
+    </w:p>
+    <w:p>
+      <w:pPr>
+        <w:spacing w:before="100" w:beforeAutospacing="1" w:after="100" w:afterAutospacing="1"/>
+        <w:ind w:left="720"/>
+        <w:jc w:val="both"/>
+        <w:rPr>
+          <w:rFonts w:ascii="Calibri" w:eastAsia="Times New Roman" w:hAnsi="Calibri" w:cs="Calibri"/>
+          <w:lang w:eastAsia="pt-BR"/>
+        </w:rPr>
+      </w:pPr>
+      <w:r>
+        <w:rPr>
+          <w:rFonts w:ascii="Calibri" w:eastAsia="Times New Roman" w:hAnsi="Calibri" w:cs="Calibri"/>
+          <w:lang w:eastAsia="pt-BR"/>
+        </w:rPr>
+        <w:drawing>
+          <wp:inline distT="0" distB="0" distL="0" distR="0" wp14:anchorId="3482A138" wp14:editId="652BF235">
+            <wp:extent cx="5396230" cy="2207895"/>
+            <wp:effectExtent l="0" t="0" r="0" b="1905"/>
+            <wp:docPr id="6" name="Imagem 6"/>
+            <wp:cNvGraphicFramePr>
+              <a:graphicFrameLocks xmlns:a="http://schemas.openxmlformats.org/drawingml/2006/main" noChangeAspect="1"/>
+            </wp:cNvGraphicFramePr>
+            <a:graphic xmlns:a="http://schemas.openxmlformats.org/drawingml/2006/main">
+              <a:graphicData uri="http://schemas.openxmlformats.org/drawingml/2006/picture">
+                <pic:pic xmlns:pic="http://schemas.openxmlformats.org/drawingml/2006/picture">
+                  <pic:nvPicPr>
+                    <pic:cNvPr id="1" name=""/>
+                    <pic:cNvPicPr/>
+                  </pic:nvPicPr>
+                  <pic:blipFill>
+                    <a:blip r:embed="rId13"/>
+                    <a:stretch>
+                      <a:fillRect/>
+                    </a:stretch>
+                  </pic:blipFill>
+                  <pic:spPr>
+                    <a:xfrm>
+                      <a:off x="0" y="0"/>
+                      <a:ext cx="5396230" cy="2207895"/>
+                    </a:xfrm>
+                    <a:prstGeom prst="rect">
+                      <a:avLst/>
+                    </a:prstGeom>
+                  </pic:spPr>
+                </pic:pic>
+              </a:graphicData>
+            </a:graphic>
+          </wp:inline>
+        </w:drawing>
+      </w:r>
+    </w:p>
+    <w:p>
+      <w:pPr>
+        <w:spacing w:before="100" w:beforeAutospacing="1" w:after="100" w:afterAutospacing="1"/>
+        <w:ind w:left="720"/>
+        <w:jc w:val="both"/>
+        <w:rPr>
+          <w:rFonts w:ascii="Calibri" w:eastAsia="Times New Roman" w:hAnsi="Calibri" w:cs="Calibri"/>
+          <w:lang w:eastAsia="pt-BR"/>
+        </w:rPr>
+      </w:pPr>
+      <w:r>
+        <w:rPr>
+          <w:rFonts w:ascii="Calibri" w:eastAsia="Times New Roman" w:hAnsi="Calibri" w:cs="Calibri"/>
+          <w:lang w:eastAsia="pt-BR"/>
+        </w:rPr>
+        <w:lastRenderedPageBreak/>
+        <w:drawing>
+          <wp:inline distT="0" distB="0" distL="0" distR="0" wp14:anchorId="1885C23D" wp14:editId="567AEB0C">
+            <wp:extent cx="5396230" cy="1876425"/>
+            <wp:effectExtent l="0" t="0" r="0" b="9525"/>
+            <wp:docPr id="7" name="Imagem 7"/>
+            <wp:cNvGraphicFramePr>
+              <a:graphicFrameLocks xmlns:a="http://schemas.openxmlformats.org/drawingml/2006/main" noChangeAspect="1"/>
+            </wp:cNvGraphicFramePr>
+            <a:graphic xmlns:a="http://schemas.openxmlformats.org/drawingml/2006/main">
+              <a:graphicData uri="http://schemas.openxmlformats.org/drawingml/2006/picture">
+                <pic:pic xmlns:pic="http://schemas.openxmlformats.org/drawingml/2006/picture">
+                  <pic:nvPicPr>
+                    <pic:cNvPr id="1" name=""/>
+                    <pic:cNvPicPr/>
+                  </pic:nvPicPr>
+                  <pic:blipFill>
+                    <a:blip r:embed="rId14"/>
+                    <a:stretch>
+                      <a:fillRect/>
+                    </a:stretch>
+                  </pic:blipFill>
+                  <pic:spPr>
+                    <a:xfrm>
+                      <a:off x="0" y="0"/>
+                      <a:ext cx="5396230" cy="1876425"/>
+                    </a:xfrm>
+                    <a:prstGeom prst="rect">
+                      <a:avLst/>
+                    </a:prstGeom>
+                  </pic:spPr>
+                </pic:pic>
+              </a:graphicData>
+            </a:graphic>
+          </wp:inline>
+        </w:drawing>
+      </w:r>
+    </w:p>
+    <w:p>
+      <w:pPr>
+        <w:spacing w:before="100" w:beforeAutospacing="1" w:after="100" w:afterAutospacing="1"/>
+        <w:ind w:left="720"/>
+        <w:jc w:val="both"/>
+        <w:rPr>
+          <w:rFonts w:ascii="Calibri" w:eastAsia="Times New Roman" w:hAnsi="Calibri" w:cs="Calibri"/>
+          <w:lang w:eastAsia="pt-BR"/>
+        </w:rPr>
+      </w:pPr>
+      <w:r>
+        <w:rPr>
+          <w:rFonts w:ascii="Calibri" w:eastAsia="Times New Roman" w:hAnsi="Calibri" w:cs="Calibri"/>
+          <w:lang w:eastAsia="pt-BR"/>
+        </w:rPr>
+        <w:drawing>
+          <wp:inline distT="0" distB="0" distL="0" distR="0" wp14:anchorId="36B9D654" wp14:editId="16BFE8B0">
+            <wp:extent cx="5396230" cy="2158365"/>
+            <wp:effectExtent l="0" t="0" r="0" b="0"/>
+            <wp:docPr id="8" name="Imagem 8"/>
+            <wp:cNvGraphicFramePr>
+              <a:graphicFrameLocks xmlns:a="http://schemas.openxmlformats.org/drawingml/2006/main" noChangeAspect="1"/>
+            </wp:cNvGraphicFramePr>
+            <a:graphic xmlns:a="http://schemas.openxmlformats.org/drawingml/2006/main">
+              <a:graphicData uri="http://schemas.openxmlformats.org/drawingml/2006/picture">
+                <pic:pic xmlns:pic="http://schemas.openxmlformats.org/drawingml/2006/picture">
+                  <pic:nvPicPr>
+                    <pic:cNvPr id="1" name=""/>
+                    <pic:cNvPicPr/>
+                  </pic:nvPicPr>
+                  <pic:blipFill>
+                    <a:blip r:embed="rId15"/>
+                    <a:stretch>
+                      <a:fillRect/>
+                    </a:stretch>
+                  </pic:blipFill>
+                  <pic:spPr>
+                    <a:xfrm>
+                      <a:off x="0" y="0"/>
+                      <a:ext cx="5396230" cy="2158365"/>
+                    </a:xfrm>
+                    <a:prstGeom prst="rect">
+                      <a:avLst/>
+                    </a:prstGeom>
+                  </pic:spPr>
+                </pic:pic>
+              </a:graphicData>
+            </a:graphic>
+          </wp:inline>
+        </w:drawing>
+      </w:r>
+    </w:p>
+    <w:p>
+      <w:pPr>
+        <w:spacing w:before="100" w:beforeAutospacing="1" w:after="100" w:afterAutospacing="1"/>
+        <w:ind w:left="720"/>
+        <w:jc w:val="both"/>
+        <w:rPr>
+          <w:rFonts w:ascii="Calibri" w:eastAsia="Times New Roman" w:hAnsi="Calibri" w:cs="Calibri"/>
+          <w:lang w:eastAsia="pt-BR"/>
+        </w:rPr>
+      </w:pPr>
+      <w:r>
+        <w:rPr>
+          <w:rFonts w:ascii="Calibri" w:eastAsia="Times New Roman" w:hAnsi="Calibri" w:cs="Calibri"/>
+          <w:lang w:eastAsia="pt-BR"/>
+        </w:rPr>
+        <w:drawing>
+          <wp:inline distT="0" distB="0" distL="0" distR="0" wp14:anchorId="4CBC1963" wp14:editId="0C2A64CE">
+            <wp:extent cx="5396230" cy="1235075"/>
+            <wp:effectExtent l="0" t="0" r="0" b="3175"/>
+            <wp:docPr id="9" name="Imagem 9"/>
+            <wp:cNvGraphicFramePr>
+              <a:graphicFrameLocks xmlns:a="http://schemas.openxmlformats.org/drawingml/2006/main" noChangeAspect="1"/>
+            </wp:cNvGraphicFramePr>
+            <a:graphic xmlns:a="http://schemas.openxmlformats.org/drawingml/2006/main">
+              <a:graphicData uri="http://schemas.openxmlformats.org/drawingml/2006/picture">
+                <pic:pic xmlns:pic="http://schemas.openxmlformats.org/drawingml/2006/picture">
+                  <pic:nvPicPr>
+                    <pic:cNvPr id="1" name=""/>
+                    <pic:cNvPicPr/>
+                  </pic:nvPicPr>
+                  <pic:blipFill>
+                    <a:blip r:embed="rId16"/>
+                    <a:stretch>
+                      <a:fillRect/>
+                    </a:stretch>
+                  </pic:blipFill>
+                  <pic:spPr>
+                    <a:xfrm>
+                      <a:off x="0" y="0"/>
+                      <a:ext cx="5396230" cy="1235075"/>
+                    </a:xfrm>
+                    <a:prstGeom prst="rect">
+                      <a:avLst/>
+                    </a:prstGeom>
+                  </pic:spPr>
+                </pic:pic>
+              </a:graphicData>
+            </a:graphic>
+          </wp:inline>
+        </w:drawing>
+      </w:r>
+    </w:p>
+    <w:p>
+      <w:pPr>
+        <w:spacing w:before="100" w:beforeAutospacing="1" w:after="100" w:afterAutospacing="1"/>
+        <w:ind w:left="720"/>
+        <w:jc w:val="both"/>
+        <w:rPr>
+          <w:rFonts w:ascii="Calibri" w:eastAsia="Times New Roman" w:hAnsi="Calibri" w:cs="Calibri"/>
+          <w:lang w:eastAsia="pt-BR"/>
+        </w:rPr>
+      </w:pPr>
+      <w:r>
+        <w:rPr>
+          <w:rFonts w:ascii="Calibri" w:eastAsia="Times New Roman" w:hAnsi="Calibri" w:cs="Calibri"/>
+          <w:lang w:eastAsia="pt-BR"/>
+        </w:rPr>
+        <w:drawing>
+          <wp:inline distT="0" distB="0" distL="0" distR="0" wp14:anchorId="347FC2A8" wp14:editId="33318824">
+            <wp:extent cx="5396230" cy="2082165"/>
+            <wp:effectExtent l="0" t="0" r="0" b="0"/>
+            <wp:docPr id="10" name="Imagem 10"/>
+            <wp:cNvGraphicFramePr>
+              <a:graphicFrameLocks xmlns:a="http://schemas.openxmlformats.org/drawingml/2006/main" noChangeAspect="1"/>
+            </wp:cNvGraphicFramePr>
+            <a:graphic xmlns:a="http://schemas.openxmlformats.org/drawingml/2006/main">
+              <a:graphicData uri="http://schemas.openxmlformats.org/drawingml/2006/picture">
+                <pic:pic xmlns:pic="http://schemas.openxmlformats.org/drawingml/2006/picture">
+                  <pic:nvPicPr>
+                    <pic:cNvPr id="1" name=""/>
+                    <pic:cNvPicPr/>
+                  </pic:nvPicPr>
+                  <pic:blipFill>
+                    <a:blip r:embed="rId17"/>
+                    <a:stretch>
+                      <a:fillRect/>
+                    </a:stretch>
+                  </pic:blipFill>
+                  <pic:spPr>
+                    <a:xfrm>
+                      <a:off x="0" y="0"/>
+                      <a:ext cx="5396230" cy="2082165"/>
+                    </a:xfrm>
+                    <a:prstGeom prst="rect">
+                      <a:avLst/>
+                    </a:prstGeom>
+                  </pic:spPr>
+                </pic:pic>
+              </a:graphicData>
+            </a:graphic>
+          </wp:inline>
+        </w:drawing>
+      </w:r>
+    </w:p>
+    <w:p>
+      <w:pPr>
+        <w:spacing w:before="100" w:beforeAutospacing="1" w:after="100" w:afterAutospacing="1"/>
+        <w:ind w:left="720"/>
+        <w:jc w:val="both"/>
+        <w:rPr>
+          <w:rFonts w:ascii="Calibri" w:eastAsia="Times New Roman" w:hAnsi="Calibri" w:cs="Calibri"/>
+          <w:lang w:eastAsia="pt-BR"/>
+        </w:rPr>
+      </w:pPr>
+      <w:r>
+        <w:rPr>
+          <w:rFonts w:ascii="Calibri" w:eastAsia="Times New Roman" w:hAnsi="Calibri" w:cs="Calibri"/>
+          <w:lang w:eastAsia="pt-BR"/>
+        </w:rPr>
+        <w:lastRenderedPageBreak/>
+        <w:drawing>
+          <wp:inline distT="0" distB="0" distL="0" distR="0" wp14:anchorId="72EBC167" wp14:editId="34B07C4E">
+            <wp:extent cx="5396230" cy="1224280"/>
+            <wp:effectExtent l="0" t="0" r="0" b="0"/>
+            <wp:docPr id="11" name="Imagem 11"/>
+            <wp:cNvGraphicFramePr>
+              <a:graphicFrameLocks xmlns:a="http://schemas.openxmlformats.org/drawingml/2006/main" noChangeAspect="1"/>
+            </wp:cNvGraphicFramePr>
+            <a:graphic xmlns:a="http://schemas.openxmlformats.org/drawingml/2006/main">
+              <a:graphicData uri="http://schemas.openxmlformats.org/drawingml/2006/picture">
+                <pic:pic xmlns:pic="http://schemas.openxmlformats.org/drawingml/2006/picture">
+                  <pic:nvPicPr>
+                    <pic:cNvPr id="1" name=""/>
+                    <pic:cNvPicPr/>
+                  </pic:nvPicPr>
+                  <pic:blipFill>
+                    <a:blip r:embed="rId18"/>
+                    <a:stretch>
+                      <a:fillRect/>
+                    </a:stretch>
+                  </pic:blipFill>
+                  <pic:spPr>
+                    <a:xfrm>
+                      <a:off x="0" y="0"/>
+                      <a:ext cx="5396230" cy="1224280"/>
+                    </a:xfrm>
+                    <a:prstGeom prst="rect">
+                      <a:avLst/>
+                    </a:prstGeom>
+                  </pic:spPr>
+                </pic:pic>
+              </a:graphicData>
+            </a:graphic>
+          </wp:inline>
+        </w:drawing>
+      </w:r>
+    </w:p>
+    <w:p>
+      <w:pPr>
+        <w:spacing w:before="100" w:beforeAutospacing="1" w:after="100" w:afterAutospacing="1"/>
+        <w:ind w:left="720"/>
+        <w:jc w:val="both"/>
+        <w:rPr>
+          <w:rFonts w:ascii="Calibri" w:eastAsia="Times New Roman" w:hAnsi="Calibri" w:cs="Calibri"/>
+          <w:lang w:eastAsia="pt-BR"/>
+        </w:rPr>
+      </w:pPr>
+      <w:r>
+        <w:rPr>
+          <w:rFonts w:ascii="Calibri" w:eastAsia="Times New Roman" w:hAnsi="Calibri" w:cs="Calibri"/>
+          <w:lang w:eastAsia="pt-BR"/>
+        </w:rPr>
+        <w:drawing>
+          <wp:inline distT="0" distB="0" distL="0" distR="0" wp14:anchorId="39CD1F96" wp14:editId="5E7CFE44">
+            <wp:extent cx="5396230" cy="1925320"/>
+            <wp:effectExtent l="0" t="0" r="0" b="0"/>
+            <wp:docPr id="12" name="Imagem 12"/>
+            <wp:cNvGraphicFramePr>
+              <a:graphicFrameLocks xmlns:a="http://schemas.openxmlformats.org/drawingml/2006/main" noChangeAspect="1"/>
+            </wp:cNvGraphicFramePr>
+            <a:graphic xmlns:a="http://schemas.openxmlformats.org/drawingml/2006/main">
+              <a:graphicData uri="http://schemas.openxmlformats.org/drawingml/2006/picture">
+                <pic:pic xmlns:pic="http://schemas.openxmlformats.org/drawingml/2006/picture">
+                  <pic:nvPicPr>
+                    <pic:cNvPr id="1" name=""/>
+                    <pic:cNvPicPr/>
+                  </pic:nvPicPr>
+                  <pic:blipFill>
+                    <a:blip r:embed="rId19"/>
+                    <a:stretch>
+                      <a:fillRect/>
+                    </a:stretch>
+                  </pic:blipFill>
+                  <pic:spPr>
+                    <a:xfrm>
+                      <a:off x="0" y="0"/>
+                      <a:ext cx="5396230" cy="1925320"/>
+                    </a:xfrm>
+                    <a:prstGeom prst="rect">
+                      <a:avLst/>
+                    </a:prstGeom>
+                  </pic:spPr>
+                </pic:pic>
+              </a:graphicData>
+            </a:graphic>
+          </wp:inline>
+        </w:drawing>
+      </w:r>
+    </w:p>
+    <w:p>
+      <w:pPr>
+        <w:spacing w:before="100" w:beforeAutospacing="1" w:after="100" w:afterAutospacing="1"/>
+        <w:ind w:left="720"/>
+        <w:jc w:val="both"/>
+        <w:rPr>
+          <w:rFonts w:ascii="Calibri" w:eastAsia="Times New Roman" w:hAnsi="Calibri" w:cs="Calibri"/>
+          <w:lang w:eastAsia="pt-BR"/>
+        </w:rPr>
+      </w:pPr>
+      <w:r>
+        <w:rPr>
+          <w:rFonts w:ascii="Calibri" w:eastAsia="Times New Roman" w:hAnsi="Calibri" w:cs="Calibri"/>
+          <w:lang w:eastAsia="pt-BR"/>
+        </w:rPr>
+        <w:drawing>
+          <wp:inline distT="0" distB="0" distL="0" distR="0" wp14:anchorId="242F548A" wp14:editId="10A5F291">
+            <wp:extent cx="5396230" cy="3159760"/>
+            <wp:effectExtent l="0" t="0" r="0" b="2540"/>
+            <wp:docPr id="13" name="Imagem 13"/>
+            <wp:cNvGraphicFramePr>
+              <a:graphicFrameLocks xmlns:a="http://schemas.openxmlformats.org/drawingml/2006/main" noChangeAspect="1"/>
+            </wp:cNvGraphicFramePr>
+            <a:graphic xmlns:a="http://schemas.openxmlformats.org/drawingml/2006/main">
+              <a:graphicData uri="http://schemas.openxmlformats.org/drawingml/2006/picture">
+                <pic:pic xmlns:pic="http://schemas.openxmlformats.org/drawingml/2006/picture">
+                  <pic:nvPicPr>
+                    <pic:cNvPr id="1" name=""/>
+                    <pic:cNvPicPr/>
+                  </pic:nvPicPr>
+                  <pic:blipFill>
+                    <a:blip r:embed="rId20"/>
+                    <a:stretch>
+                      <a:fillRect/>
+                    </a:stretch>
+                  </pic:blipFill>
+                  <pic:spPr>
+                    <a:xfrm>
+                      <a:off x="0" y="0"/>
+                      <a:ext cx="5396230" cy="3159760"/>
+                    </a:xfrm>
+                    <a:prstGeom prst="rect">
+                      <a:avLst/>
+                    </a:prstGeom>
+                  </pic:spPr>
+                </pic:pic>
+              </a:graphicData>
+            </a:graphic>
+          </wp:inline>
+        </w:drawing>
+      </w:r>
+    </w:p>
+    <w:p>
+      <w:pPr>
+        <w:spacing w:before="100" w:beforeAutospacing="1" w:after="100" w:afterAutospacing="1"/>
+        <w:ind w:left="720"/>
+        <w:jc w:val="both"/>
+        <w:rPr>
+          <w:rFonts w:ascii="Calibri" w:eastAsia="Times New Roman" w:hAnsi="Calibri" w:cs="Calibri"/>
+          <w:lang w:eastAsia="pt-BR"/>
+        </w:rPr>
+      </w:pPr>
+      <w:r>
+        <w:rPr>
+          <w:rFonts w:ascii="Calibri" w:eastAsia="Times New Roman" w:hAnsi="Calibri" w:cs="Calibri"/>
+          <w:lang w:eastAsia="pt-BR"/>
+        </w:rPr>
+        <w:lastRenderedPageBreak/>
+        <w:drawing>
+          <wp:inline distT="0" distB="0" distL="0" distR="0" wp14:anchorId="395E09F6" wp14:editId="4FF99E5E">
+            <wp:extent cx="5396230" cy="2259965"/>
+            <wp:effectExtent l="0" t="0" r="0" b="6985"/>
+            <wp:docPr id="14" name="Imagem 14"/>
+            <wp:cNvGraphicFramePr>
+              <a:graphicFrameLocks xmlns:a="http://schemas.openxmlformats.org/drawingml/2006/main" noChangeAspect="1"/>
+            </wp:cNvGraphicFramePr>
+            <a:graphic xmlns:a="http://schemas.openxmlformats.org/drawingml/2006/main">
+              <a:graphicData uri="http://schemas.openxmlformats.org/drawingml/2006/picture">
+                <pic:pic xmlns:pic="http://schemas.openxmlformats.org/drawingml/2006/picture">
+                  <pic:nvPicPr>
+                    <pic:cNvPr id="1" name=""/>
+                    <pic:cNvPicPr/>
+                  </pic:nvPicPr>
+                  <pic:blipFill>
+                    <a:blip r:embed="rId21"/>
+                    <a:stretch>
+                      <a:fillRect/>
+                    </a:stretch>
+                  </pic:blipFill>
+                  <pic:spPr>
+                    <a:xfrm>
+                      <a:off x="0" y="0"/>
+                      <a:ext cx="5396230" cy="2259965"/>
+                    </a:xfrm>
+                    <a:prstGeom prst="rect">
+                      <a:avLst/>
+                    </a:prstGeom>
+                  </pic:spPr>
+                </pic:pic>
+              </a:graphicData>
+            </a:graphic>
+          </wp:inline>
+        </w:drawing>
+      </w:r>
     </w:p>
     <w:p>
       <w:pPr>
@@ -1711,7 +2844,6 @@
           <w:bCs/>
           <w:lang w:eastAsia="pt-BR"/>
         </w:rPr>
-        <w:lastRenderedPageBreak/>
         <w:t>Decisões Baseadas em Dados:</w:t>
       </w:r>
       <w:r>
@@ -1719,7 +2851,105 @@
           <w:rFonts w:ascii="Calibri" w:eastAsia="Times New Roman" w:hAnsi="Calibri" w:cs="Calibri"/>
           <w:lang w:eastAsia="pt-BR"/>
         </w:rPr>
-        <w:t xml:space="preserve"> Explique claramente como os dados influenciam as decisões do design do projeto. Utilize gráficos para ilustrar pontos importantes.</w:t>
+        <w:t xml:space="preserve"> </w:t>
+      </w:r>
+      <w:r>
+        <w:rPr>
+          <w:rFonts w:ascii="Arial" w:eastAsia="Times New Roman" w:hAnsi="Arial" w:cs="Arial"/>
+          <w:lang w:eastAsia="pt-BR"/>
+        </w:rPr>
+        <w:t>Analisando os dados coletados na pesquisa em relação ao design e o layout</w:t>
+      </w:r>
+      <w:r>
+        <w:rPr>
+          <w:rFonts w:ascii="Arial" w:eastAsia="Times New Roman" w:hAnsi="Arial" w:cs="Arial"/>
+          <w:lang w:eastAsia="pt-BR"/>
+        </w:rPr>
+        <w:t xml:space="preserve"> da </w:t>
+      </w:r>
+      <w:proofErr w:type="spellStart"/>
+      <w:r>
+        <w:rPr>
+          <w:rFonts w:ascii="Arial" w:eastAsia="Times New Roman" w:hAnsi="Arial" w:cs="Arial"/>
+          <w:lang w:eastAsia="pt-BR"/>
+        </w:rPr>
+        <w:t>pagina</w:t>
+      </w:r>
+      <w:proofErr w:type="spellEnd"/>
+      <w:r>
+        <w:rPr>
+          <w:rFonts w:ascii="Arial" w:eastAsia="Times New Roman" w:hAnsi="Arial" w:cs="Arial"/>
+          <w:lang w:eastAsia="pt-BR"/>
+        </w:rPr>
+        <w:t xml:space="preserve"> do site da </w:t>
+      </w:r>
+      <w:proofErr w:type="spellStart"/>
+      <w:r>
+        <w:rPr>
+          <w:rFonts w:ascii="Arial" w:eastAsia="Times New Roman" w:hAnsi="Arial" w:cs="Arial"/>
+          <w:lang w:eastAsia="pt-BR"/>
+        </w:rPr>
+        <w:t>Jogoteca</w:t>
+      </w:r>
+      <w:proofErr w:type="spellEnd"/>
+      <w:r>
+        <w:rPr>
+          <w:rFonts w:ascii="Arial" w:eastAsia="Times New Roman" w:hAnsi="Arial" w:cs="Arial"/>
+          <w:lang w:eastAsia="pt-BR"/>
+        </w:rPr>
+        <w:t xml:space="preserve">, podemos concluir que o design é um dos pontos mais negativos do site, ele é confuso, com muita informação, mal organizado e nada atrativo aos olhos do público. Logo, para melhorarmos a qualidade do site devemos focar na organização do conteúdo, na disposição do Layout e na paleta de cores. Como podemos observar pelo gráfico feito com a opinião dos usuários: </w:t>
+      </w:r>
+    </w:p>
+    <w:p>
+      <w:pPr>
+        <w:spacing w:before="100" w:beforeAutospacing="1" w:after="100" w:afterAutospacing="1"/>
+        <w:ind w:left="720"/>
+        <w:jc w:val="both"/>
+        <w:rPr>
+          <w:rFonts w:ascii="Calibri" w:eastAsia="Times New Roman" w:hAnsi="Calibri" w:cs="Calibri"/>
+          <w:lang w:eastAsia="pt-BR"/>
+        </w:rPr>
+      </w:pPr>
+      <w:r>
+        <w:rPr>
+          <w:rFonts w:ascii="Calibri" w:eastAsia="Times New Roman" w:hAnsi="Calibri" w:cs="Calibri"/>
+          <w:lang w:eastAsia="pt-BR"/>
+        </w:rPr>
+        <w:drawing>
+          <wp:inline distT="0" distB="0" distL="0" distR="0" wp14:anchorId="1809F177" wp14:editId="36B62881">
+            <wp:extent cx="5396230" cy="2259965"/>
+            <wp:effectExtent l="0" t="0" r="0" b="6985"/>
+            <wp:docPr id="15" name="Imagem 15"/>
+            <wp:cNvGraphicFramePr>
+              <a:graphicFrameLocks xmlns:a="http://schemas.openxmlformats.org/drawingml/2006/main" noChangeAspect="1"/>
+            </wp:cNvGraphicFramePr>
+            <a:graphic xmlns:a="http://schemas.openxmlformats.org/drawingml/2006/main">
+              <a:graphicData uri="http://schemas.openxmlformats.org/drawingml/2006/picture">
+                <pic:pic xmlns:pic="http://schemas.openxmlformats.org/drawingml/2006/picture">
+                  <pic:nvPicPr>
+                    <pic:cNvPr id="1" name=""/>
+                    <pic:cNvPicPr/>
+                  </pic:nvPicPr>
+                  <pic:blipFill>
+                    <a:blip r:embed="rId21"/>
+                    <a:stretch>
+                      <a:fillRect/>
+                    </a:stretch>
+                  </pic:blipFill>
+                  <pic:spPr>
+                    <a:xfrm>
+                      <a:off x="0" y="0"/>
+                      <a:ext cx="5396230" cy="2259965"/>
+                    </a:xfrm>
+                    <a:prstGeom prst="rect">
+                      <a:avLst/>
+                    </a:prstGeom>
+                  </pic:spPr>
+                </pic:pic>
+              </a:graphicData>
+            </a:graphic>
+          </wp:inline>
+        </w:drawing>
       </w:r>
     </w:p>
     <w:p>
@@ -1830,6 +3060,7 @@
           <w:rFonts w:eastAsia="Times New Roman"/>
           <w:lang w:eastAsia="pt-BR"/>
         </w:rPr>
+        <w:lastRenderedPageBreak/>
         <w:t>Design de Interface</w:t>
       </w:r>
       <w:bookmarkEnd w:id="5"/>
@@ -2210,7 +3441,6 @@
           <w:rFonts w:eastAsia="Times New Roman"/>
           <w:lang w:eastAsia="pt-BR"/>
         </w:rPr>
-        <w:lastRenderedPageBreak/>
         <w:t>Questões Legais</w:t>
       </w:r>
       <w:bookmarkEnd w:id="8"/>
@@ -2369,6 +3599,7 @@
           <w:rFonts w:eastAsia="Times New Roman"/>
           <w:lang w:eastAsia="pt-BR"/>
         </w:rPr>
+        <w:lastRenderedPageBreak/>
         <w:t>Implementação</w:t>
       </w:r>
       <w:bookmarkEnd w:id="10"/>
@@ -2586,9 +3817,9 @@
       </w:pPr>
     </w:p>
     <w:sectPr>
-      <w:headerReference w:type="default" r:id="rId10"/>
-      <w:footerReference w:type="even" r:id="rId11"/>
-      <w:footerReference w:type="default" r:id="rId12"/>
+      <w:headerReference w:type="default" r:id="rId22"/>
+      <w:footerReference w:type="even" r:id="rId23"/>
+      <w:footerReference w:type="default" r:id="rId24"/>
       <w:pgSz w:w="11900" w:h="16840"/>
       <w:pgMar w:top="1417" w:right="1701" w:bottom="1417" w:left="1701" w:header="708" w:footer="708" w:gutter="0"/>
       <w:cols w:space="708"/>
@@ -10391,7 +11622,7 @@
 </file>
 
 <file path=customXml/itemProps1.xml><?xml version="1.0" encoding="utf-8"?>
-<ds:datastoreItem xmlns:ds="http://schemas.openxmlformats.org/officeDocument/2006/customXml" ds:itemID="{C49ED33E-2538-4BDE-B124-83A3ACB73E2C}">
+<ds:datastoreItem xmlns:ds="http://schemas.openxmlformats.org/officeDocument/2006/customXml" ds:itemID="{E8FE2F7F-64C9-4B64-A26F-A3B9CD9F9FA6}">
   <ds:schemaRefs>
     <ds:schemaRef ds:uri="http://schemas.openxmlformats.org/officeDocument/2006/bibliography"/>
   </ds:schemaRefs>

</xml_diff>